<commit_message>
add: DataFlows to dictionary
</commit_message>
<xml_diff>
--- a/Nati_Goral_IDS_Documentation_OnlyText.docx
+++ b/Nati_Goral_IDS_Documentation_OnlyText.docx
@@ -15954,14 +15954,14 @@
       </w:tr>
       <w:tr>
         <w:trPr>
-          <w:trHeight w:val="624"/>
+          <w:trHeight w:val="362"/>
         </w:trPr>
         <w:tc>
           <w:tcPr>
             <w:tcW w:w="751" w:type="dxa"/>
             <w:tcBorders>
               <w:left w:val="single" w:sz="2" w:space="0" w:color="000000"/>
-              <w:bottom w:val="single" w:sz="2" w:space="0" w:color="000000"/>
+              <w:bottom w:val="single" w:sz="4" w:space="0" w:color="auto"/>
             </w:tcBorders>
             <w:vAlign w:val="center"/>
           </w:tcPr>
@@ -15980,7 +15980,7 @@
             <w:tcW w:w="3600" w:type="dxa"/>
             <w:tcBorders>
               <w:left w:val="single" w:sz="2" w:space="0" w:color="000000"/>
-              <w:bottom w:val="single" w:sz="2" w:space="0" w:color="000000"/>
+              <w:bottom w:val="single" w:sz="4" w:space="0" w:color="auto"/>
             </w:tcBorders>
             <w:vAlign w:val="center"/>
           </w:tcPr>
@@ -16002,7 +16002,7 @@
             <w:tcW w:w="2888" w:type="dxa"/>
             <w:tcBorders>
               <w:left w:val="single" w:sz="2" w:space="0" w:color="000000"/>
-              <w:bottom w:val="single" w:sz="2" w:space="0" w:color="000000"/>
+              <w:bottom w:val="single" w:sz="4" w:space="0" w:color="auto"/>
             </w:tcBorders>
             <w:vAlign w:val="center"/>
           </w:tcPr>
@@ -16021,7 +16021,7 @@
             <w:tcW w:w="1787" w:type="dxa"/>
             <w:tcBorders>
               <w:left w:val="single" w:sz="2" w:space="0" w:color="000000"/>
-              <w:bottom w:val="single" w:sz="2" w:space="0" w:color="000000"/>
+              <w:bottom w:val="single" w:sz="4" w:space="0" w:color="auto"/>
               <w:right w:val="single" w:sz="2" w:space="0" w:color="000000"/>
             </w:tcBorders>
             <w:vAlign w:val="center"/>
@@ -16036,6 +16036,631 @@
                 <w:rtl/>
               </w:rPr>
               <w:t>מערכת</w:t>
+            </w:r>
+          </w:p>
+        </w:tc>
+      </w:tr>
+      <w:tr>
+        <w:trPr>
+          <w:trHeight w:val="362"/>
+        </w:trPr>
+        <w:tc>
+          <w:tcPr>
+            <w:tcW w:w="751" w:type="dxa"/>
+            <w:tcBorders>
+              <w:top w:val="single" w:sz="4" w:space="0" w:color="auto"/>
+              <w:left w:val="single" w:sz="2" w:space="0" w:color="000000"/>
+              <w:bottom w:val="single" w:sz="4" w:space="0" w:color="auto"/>
+            </w:tcBorders>
+            <w:vAlign w:val="center"/>
+          </w:tcPr>
+          <w:p>
+            <w:pPr>
+              <w:pStyle w:val="TableContents"/>
+              <w:bidi/>
+            </w:pPr>
+            <w:r>
+              <w:t>F9</w:t>
+            </w:r>
+          </w:p>
+        </w:tc>
+        <w:tc>
+          <w:tcPr>
+            <w:tcW w:w="3600" w:type="dxa"/>
+            <w:tcBorders>
+              <w:top w:val="single" w:sz="4" w:space="0" w:color="auto"/>
+              <w:left w:val="single" w:sz="2" w:space="0" w:color="000000"/>
+              <w:bottom w:val="single" w:sz="4" w:space="0" w:color="auto"/>
+            </w:tcBorders>
+            <w:vAlign w:val="center"/>
+          </w:tcPr>
+          <w:p>
+            <w:pPr>
+              <w:pStyle w:val="TableContents"/>
+              <w:bidi/>
+              <w:rPr>
+                <w:rFonts w:cstheme="minorBidi" w:hint="cs"/>
+                <w:rtl/>
+              </w:rPr>
+            </w:pPr>
+            <w:r>
+              <w:rPr>
+                <w:rFonts w:cstheme="minorBidi" w:hint="cs"/>
+                <w:rtl/>
+              </w:rPr>
+              <w:t>בקשת שינוי מצב</w:t>
+            </w:r>
+          </w:p>
+        </w:tc>
+        <w:tc>
+          <w:tcPr>
+            <w:tcW w:w="2888" w:type="dxa"/>
+            <w:tcBorders>
+              <w:top w:val="single" w:sz="4" w:space="0" w:color="auto"/>
+              <w:left w:val="single" w:sz="2" w:space="0" w:color="000000"/>
+              <w:bottom w:val="single" w:sz="4" w:space="0" w:color="auto"/>
+            </w:tcBorders>
+            <w:vAlign w:val="center"/>
+          </w:tcPr>
+          <w:p>
+            <w:pPr>
+              <w:pStyle w:val="TableContents"/>
+              <w:bidi/>
+              <w:rPr>
+                <w:rFonts w:cstheme="minorBidi" w:hint="cs"/>
+                <w:rtl/>
+                <w:lang w:val="en-US"/>
+              </w:rPr>
+            </w:pPr>
+            <w:r>
+              <w:t>E1</w:t>
+            </w:r>
+          </w:p>
+        </w:tc>
+        <w:tc>
+          <w:tcPr>
+            <w:tcW w:w="1787" w:type="dxa"/>
+            <w:tcBorders>
+              <w:top w:val="single" w:sz="4" w:space="0" w:color="auto"/>
+              <w:left w:val="single" w:sz="2" w:space="0" w:color="000000"/>
+              <w:bottom w:val="single" w:sz="4" w:space="0" w:color="auto"/>
+              <w:right w:val="single" w:sz="2" w:space="0" w:color="000000"/>
+            </w:tcBorders>
+            <w:vAlign w:val="center"/>
+          </w:tcPr>
+          <w:p>
+            <w:pPr>
+              <w:pStyle w:val="TableContents"/>
+              <w:bidi/>
+              <w:rPr>
+                <w:rFonts w:cstheme="minorBidi" w:hint="cs"/>
+                <w:rtl/>
+                <w:lang w:val="en-US"/>
+              </w:rPr>
+            </w:pPr>
+            <w:r>
+              <w:t>P6</w:t>
+            </w:r>
+          </w:p>
+        </w:tc>
+      </w:tr>
+      <w:tr>
+        <w:trPr>
+          <w:trHeight w:val="362"/>
+        </w:trPr>
+        <w:tc>
+          <w:tcPr>
+            <w:tcW w:w="751" w:type="dxa"/>
+            <w:tcBorders>
+              <w:top w:val="single" w:sz="4" w:space="0" w:color="auto"/>
+              <w:left w:val="single" w:sz="2" w:space="0" w:color="000000"/>
+              <w:bottom w:val="single" w:sz="4" w:space="0" w:color="auto"/>
+            </w:tcBorders>
+            <w:vAlign w:val="center"/>
+          </w:tcPr>
+          <w:p>
+            <w:pPr>
+              <w:pStyle w:val="TableContents"/>
+              <w:bidi/>
+              <w:rPr>
+                <w:rFonts w:cstheme="minorBidi" w:hint="cs"/>
+                <w:rtl/>
+                <w:lang w:val="en-US"/>
+              </w:rPr>
+            </w:pPr>
+            <w:r>
+              <w:rPr>
+                <w:lang w:val="en-US"/>
+              </w:rPr>
+              <w:t>F10</w:t>
+            </w:r>
+          </w:p>
+        </w:tc>
+        <w:tc>
+          <w:tcPr>
+            <w:tcW w:w="3600" w:type="dxa"/>
+            <w:tcBorders>
+              <w:top w:val="single" w:sz="4" w:space="0" w:color="auto"/>
+              <w:left w:val="single" w:sz="2" w:space="0" w:color="000000"/>
+              <w:bottom w:val="single" w:sz="4" w:space="0" w:color="auto"/>
+            </w:tcBorders>
+            <w:vAlign w:val="center"/>
+          </w:tcPr>
+          <w:p>
+            <w:pPr>
+              <w:pStyle w:val="TableContents"/>
+              <w:bidi/>
+              <w:rPr>
+                <w:rFonts w:cstheme="minorBidi" w:hint="cs"/>
+                <w:rtl/>
+              </w:rPr>
+            </w:pPr>
+            <w:r>
+              <w:rPr>
+                <w:rFonts w:cstheme="minorBidi" w:hint="cs"/>
+                <w:rtl/>
+              </w:rPr>
+              <w:t>תעבורת רשת</w:t>
+            </w:r>
+          </w:p>
+        </w:tc>
+        <w:tc>
+          <w:tcPr>
+            <w:tcW w:w="2888" w:type="dxa"/>
+            <w:tcBorders>
+              <w:top w:val="single" w:sz="4" w:space="0" w:color="auto"/>
+              <w:left w:val="single" w:sz="2" w:space="0" w:color="000000"/>
+              <w:bottom w:val="single" w:sz="4" w:space="0" w:color="auto"/>
+            </w:tcBorders>
+            <w:vAlign w:val="center"/>
+          </w:tcPr>
+          <w:p>
+            <w:pPr>
+              <w:pStyle w:val="TableContents"/>
+              <w:bidi/>
+              <w:rPr>
+                <w:rFonts w:cstheme="minorBidi" w:hint="cs"/>
+                <w:rtl/>
+                <w:lang w:val="en-US"/>
+              </w:rPr>
+            </w:pPr>
+            <w:r>
+              <w:t>E3</w:t>
+            </w:r>
+          </w:p>
+        </w:tc>
+        <w:tc>
+          <w:tcPr>
+            <w:tcW w:w="1787" w:type="dxa"/>
+            <w:tcBorders>
+              <w:top w:val="single" w:sz="4" w:space="0" w:color="auto"/>
+              <w:left w:val="single" w:sz="2" w:space="0" w:color="000000"/>
+              <w:bottom w:val="single" w:sz="4" w:space="0" w:color="auto"/>
+              <w:right w:val="single" w:sz="2" w:space="0" w:color="000000"/>
+            </w:tcBorders>
+            <w:vAlign w:val="center"/>
+          </w:tcPr>
+          <w:p>
+            <w:pPr>
+              <w:pStyle w:val="TableContents"/>
+              <w:bidi/>
+              <w:rPr>
+                <w:lang w:val="en-US"/>
+              </w:rPr>
+            </w:pPr>
+            <w:r>
+              <w:rPr>
+                <w:lang w:val="en-US"/>
+              </w:rPr>
+              <w:t>P2</w:t>
+            </w:r>
+          </w:p>
+        </w:tc>
+      </w:tr>
+      <w:tr>
+        <w:trPr>
+          <w:trHeight w:val="362"/>
+        </w:trPr>
+        <w:tc>
+          <w:tcPr>
+            <w:tcW w:w="751" w:type="dxa"/>
+            <w:tcBorders>
+              <w:top w:val="single" w:sz="4" w:space="0" w:color="auto"/>
+              <w:left w:val="single" w:sz="2" w:space="0" w:color="000000"/>
+              <w:bottom w:val="single" w:sz="4" w:space="0" w:color="auto"/>
+            </w:tcBorders>
+            <w:vAlign w:val="center"/>
+          </w:tcPr>
+          <w:p>
+            <w:pPr>
+              <w:pStyle w:val="TableContents"/>
+              <w:bidi/>
+            </w:pPr>
+            <w:r>
+              <w:t>F11</w:t>
+            </w:r>
+          </w:p>
+        </w:tc>
+        <w:tc>
+          <w:tcPr>
+            <w:tcW w:w="3600" w:type="dxa"/>
+            <w:tcBorders>
+              <w:top w:val="single" w:sz="4" w:space="0" w:color="auto"/>
+              <w:left w:val="single" w:sz="2" w:space="0" w:color="000000"/>
+              <w:bottom w:val="single" w:sz="4" w:space="0" w:color="auto"/>
+            </w:tcBorders>
+            <w:vAlign w:val="center"/>
+          </w:tcPr>
+          <w:p>
+            <w:pPr>
+              <w:pStyle w:val="TableContents"/>
+              <w:bidi/>
+              <w:rPr>
+                <w:rFonts w:cstheme="minorBidi" w:hint="cs"/>
+                <w:rtl/>
+              </w:rPr>
+            </w:pPr>
+            <w:r>
+              <w:rPr>
+                <w:rFonts w:cstheme="minorBidi" w:hint="cs"/>
+                <w:rtl/>
+              </w:rPr>
+              <w:t>הודעת סטטוס מערכת</w:t>
+            </w:r>
+          </w:p>
+        </w:tc>
+        <w:tc>
+          <w:tcPr>
+            <w:tcW w:w="2888" w:type="dxa"/>
+            <w:tcBorders>
+              <w:top w:val="single" w:sz="4" w:space="0" w:color="auto"/>
+              <w:left w:val="single" w:sz="2" w:space="0" w:color="000000"/>
+              <w:bottom w:val="single" w:sz="4" w:space="0" w:color="auto"/>
+            </w:tcBorders>
+            <w:vAlign w:val="center"/>
+          </w:tcPr>
+          <w:p>
+            <w:pPr>
+              <w:pStyle w:val="TableContents"/>
+              <w:bidi/>
+              <w:rPr>
+                <w:rFonts w:hint="cs"/>
+                <w:rtl/>
+                <w:lang w:val="en-US"/>
+              </w:rPr>
+            </w:pPr>
+            <w:r>
+              <w:rPr>
+                <w:lang w:val="en-US"/>
+              </w:rPr>
+              <w:t>P6</w:t>
+            </w:r>
+          </w:p>
+        </w:tc>
+        <w:tc>
+          <w:tcPr>
+            <w:tcW w:w="1787" w:type="dxa"/>
+            <w:tcBorders>
+              <w:top w:val="single" w:sz="4" w:space="0" w:color="auto"/>
+              <w:left w:val="single" w:sz="2" w:space="0" w:color="000000"/>
+              <w:bottom w:val="single" w:sz="4" w:space="0" w:color="auto"/>
+              <w:right w:val="single" w:sz="2" w:space="0" w:color="000000"/>
+            </w:tcBorders>
+            <w:vAlign w:val="center"/>
+          </w:tcPr>
+          <w:p>
+            <w:pPr>
+              <w:pStyle w:val="TableContents"/>
+              <w:bidi/>
+            </w:pPr>
+            <w:r>
+              <w:t>E1</w:t>
+            </w:r>
+          </w:p>
+        </w:tc>
+      </w:tr>
+      <w:tr>
+        <w:trPr>
+          <w:trHeight w:val="362"/>
+        </w:trPr>
+        <w:tc>
+          <w:tcPr>
+            <w:tcW w:w="751" w:type="dxa"/>
+            <w:tcBorders>
+              <w:top w:val="single" w:sz="4" w:space="0" w:color="auto"/>
+              <w:left w:val="single" w:sz="2" w:space="0" w:color="000000"/>
+              <w:bottom w:val="single" w:sz="4" w:space="0" w:color="auto"/>
+            </w:tcBorders>
+            <w:vAlign w:val="center"/>
+          </w:tcPr>
+          <w:p>
+            <w:pPr>
+              <w:pStyle w:val="TableContents"/>
+              <w:bidi/>
+            </w:pPr>
+            <w:r>
+              <w:t>F12</w:t>
+            </w:r>
+          </w:p>
+        </w:tc>
+        <w:tc>
+          <w:tcPr>
+            <w:tcW w:w="3600" w:type="dxa"/>
+            <w:tcBorders>
+              <w:top w:val="single" w:sz="4" w:space="0" w:color="auto"/>
+              <w:left w:val="single" w:sz="2" w:space="0" w:color="000000"/>
+              <w:bottom w:val="single" w:sz="4" w:space="0" w:color="auto"/>
+            </w:tcBorders>
+            <w:vAlign w:val="center"/>
+          </w:tcPr>
+          <w:p>
+            <w:pPr>
+              <w:pStyle w:val="TableContents"/>
+              <w:bidi/>
+              <w:rPr>
+                <w:rFonts w:cstheme="minorBidi" w:hint="cs"/>
+                <w:rtl/>
+              </w:rPr>
+            </w:pPr>
+            <w:r>
+              <w:rPr>
+                <w:rFonts w:cstheme="minorBidi" w:hint="cs"/>
+                <w:rtl/>
+              </w:rPr>
+              <w:t>פרטי בקשת דוח</w:t>
+            </w:r>
+          </w:p>
+        </w:tc>
+        <w:tc>
+          <w:tcPr>
+            <w:tcW w:w="2888" w:type="dxa"/>
+            <w:tcBorders>
+              <w:top w:val="single" w:sz="4" w:space="0" w:color="auto"/>
+              <w:left w:val="single" w:sz="2" w:space="0" w:color="000000"/>
+              <w:bottom w:val="single" w:sz="4" w:space="0" w:color="auto"/>
+            </w:tcBorders>
+            <w:vAlign w:val="center"/>
+          </w:tcPr>
+          <w:p>
+            <w:pPr>
+              <w:pStyle w:val="TableContents"/>
+              <w:bidi/>
+              <w:rPr>
+                <w:rFonts w:hint="cs"/>
+                <w:rtl/>
+                <w:lang w:val="en-US"/>
+              </w:rPr>
+            </w:pPr>
+            <w:r>
+              <w:rPr>
+                <w:lang w:val="en-US"/>
+              </w:rPr>
+              <w:t>E1/E2</w:t>
+            </w:r>
+          </w:p>
+        </w:tc>
+        <w:tc>
+          <w:tcPr>
+            <w:tcW w:w="1787" w:type="dxa"/>
+            <w:tcBorders>
+              <w:top w:val="single" w:sz="4" w:space="0" w:color="auto"/>
+              <w:left w:val="single" w:sz="2" w:space="0" w:color="000000"/>
+              <w:bottom w:val="single" w:sz="4" w:space="0" w:color="auto"/>
+              <w:right w:val="single" w:sz="2" w:space="0" w:color="000000"/>
+            </w:tcBorders>
+            <w:vAlign w:val="center"/>
+          </w:tcPr>
+          <w:p>
+            <w:pPr>
+              <w:pStyle w:val="TableContents"/>
+              <w:bidi/>
+            </w:pPr>
+            <w:r>
+              <w:t>P5</w:t>
+            </w:r>
+          </w:p>
+        </w:tc>
+      </w:tr>
+      <w:tr>
+        <w:trPr>
+          <w:trHeight w:val="362"/>
+        </w:trPr>
+        <w:tc>
+          <w:tcPr>
+            <w:tcW w:w="751" w:type="dxa"/>
+            <w:tcBorders>
+              <w:top w:val="single" w:sz="4" w:space="0" w:color="auto"/>
+              <w:left w:val="single" w:sz="2" w:space="0" w:color="000000"/>
+              <w:bottom w:val="single" w:sz="4" w:space="0" w:color="auto"/>
+            </w:tcBorders>
+            <w:vAlign w:val="center"/>
+          </w:tcPr>
+          <w:p>
+            <w:pPr>
+              <w:pStyle w:val="TableContents"/>
+              <w:bidi/>
+            </w:pPr>
+            <w:r>
+              <w:t>F13</w:t>
+            </w:r>
+          </w:p>
+        </w:tc>
+        <w:tc>
+          <w:tcPr>
+            <w:tcW w:w="3600" w:type="dxa"/>
+            <w:tcBorders>
+              <w:top w:val="single" w:sz="4" w:space="0" w:color="auto"/>
+              <w:left w:val="single" w:sz="2" w:space="0" w:color="000000"/>
+              <w:bottom w:val="single" w:sz="4" w:space="0" w:color="auto"/>
+            </w:tcBorders>
+            <w:vAlign w:val="center"/>
+          </w:tcPr>
+          <w:p>
+            <w:pPr>
+              <w:pStyle w:val="TableContents"/>
+              <w:bidi/>
+              <w:rPr>
+                <w:rFonts w:cstheme="minorBidi" w:hint="cs"/>
+                <w:rtl/>
+              </w:rPr>
+            </w:pPr>
+            <w:r>
+              <w:rPr>
+                <w:rFonts w:cstheme="minorBidi" w:hint="cs"/>
+                <w:rtl/>
+              </w:rPr>
+              <w:t>נתוני זרימה</w:t>
+            </w:r>
+          </w:p>
+        </w:tc>
+        <w:tc>
+          <w:tcPr>
+            <w:tcW w:w="2888" w:type="dxa"/>
+            <w:tcBorders>
+              <w:top w:val="single" w:sz="4" w:space="0" w:color="auto"/>
+              <w:left w:val="single" w:sz="2" w:space="0" w:color="000000"/>
+              <w:bottom w:val="single" w:sz="4" w:space="0" w:color="auto"/>
+            </w:tcBorders>
+            <w:vAlign w:val="center"/>
+          </w:tcPr>
+          <w:p>
+            <w:pPr>
+              <w:pStyle w:val="TableContents"/>
+              <w:bidi/>
+              <w:rPr>
+                <w:rFonts w:hint="cs"/>
+                <w:rtl/>
+                <w:lang w:val="en-US"/>
+              </w:rPr>
+            </w:pPr>
+            <w:r>
+              <w:rPr>
+                <w:lang w:val="en-US"/>
+              </w:rPr>
+              <w:t>DB7</w:t>
+            </w:r>
+          </w:p>
+        </w:tc>
+        <w:tc>
+          <w:tcPr>
+            <w:tcW w:w="1787" w:type="dxa"/>
+            <w:tcBorders>
+              <w:top w:val="single" w:sz="4" w:space="0" w:color="auto"/>
+              <w:left w:val="single" w:sz="2" w:space="0" w:color="000000"/>
+              <w:bottom w:val="single" w:sz="4" w:space="0" w:color="auto"/>
+              <w:right w:val="single" w:sz="2" w:space="0" w:color="000000"/>
+            </w:tcBorders>
+            <w:vAlign w:val="center"/>
+          </w:tcPr>
+          <w:p>
+            <w:pPr>
+              <w:pStyle w:val="TableContents"/>
+              <w:bidi/>
+            </w:pPr>
+            <w:r>
+              <w:t>P3/P5</w:t>
+            </w:r>
+          </w:p>
+        </w:tc>
+      </w:tr>
+      <w:tr>
+        <w:trPr>
+          <w:trHeight w:val="362"/>
+        </w:trPr>
+        <w:tc>
+          <w:tcPr>
+            <w:tcW w:w="751" w:type="dxa"/>
+            <w:tcBorders>
+              <w:top w:val="single" w:sz="4" w:space="0" w:color="auto"/>
+              <w:left w:val="single" w:sz="2" w:space="0" w:color="000000"/>
+              <w:bottom w:val="single" w:sz="2" w:space="0" w:color="000000"/>
+            </w:tcBorders>
+            <w:vAlign w:val="center"/>
+          </w:tcPr>
+          <w:p>
+            <w:pPr>
+              <w:pStyle w:val="TableContents"/>
+              <w:bidi/>
+            </w:pPr>
+            <w:r>
+              <w:t>F14</w:t>
+            </w:r>
+          </w:p>
+        </w:tc>
+        <w:tc>
+          <w:tcPr>
+            <w:tcW w:w="3600" w:type="dxa"/>
+            <w:tcBorders>
+              <w:top w:val="single" w:sz="4" w:space="0" w:color="auto"/>
+              <w:left w:val="single" w:sz="2" w:space="0" w:color="000000"/>
+              <w:bottom w:val="single" w:sz="2" w:space="0" w:color="000000"/>
+            </w:tcBorders>
+            <w:vAlign w:val="center"/>
+          </w:tcPr>
+          <w:p>
+            <w:pPr>
+              <w:pStyle w:val="TableContents"/>
+              <w:bidi/>
+              <w:rPr>
+                <w:rFonts w:cstheme="minorBidi" w:hint="cs"/>
+                <w:rtl/>
+              </w:rPr>
+            </w:pPr>
+            <w:r>
+              <w:rPr>
+                <w:rFonts w:cstheme="minorBidi" w:hint="cs"/>
+                <w:rtl/>
+              </w:rPr>
+              <w:t>תיעוד גישה</w:t>
+            </w:r>
+          </w:p>
+        </w:tc>
+        <w:tc>
+          <w:tcPr>
+            <w:tcW w:w="2888" w:type="dxa"/>
+            <w:tcBorders>
+              <w:top w:val="single" w:sz="4" w:space="0" w:color="auto"/>
+              <w:left w:val="single" w:sz="2" w:space="0" w:color="000000"/>
+              <w:bottom w:val="single" w:sz="2" w:space="0" w:color="000000"/>
+            </w:tcBorders>
+            <w:vAlign w:val="center"/>
+          </w:tcPr>
+          <w:p>
+            <w:pPr>
+              <w:pStyle w:val="TableContents"/>
+              <w:bidi/>
+              <w:rPr>
+                <w:rFonts w:hint="cs"/>
+                <w:rtl/>
+                <w:lang w:val="en-US"/>
+              </w:rPr>
+            </w:pPr>
+            <w:r>
+              <w:rPr>
+                <w:lang w:val="en-US"/>
+              </w:rPr>
+              <w:t>P1</w:t>
+            </w:r>
+          </w:p>
+        </w:tc>
+        <w:tc>
+          <w:tcPr>
+            <w:tcW w:w="1787" w:type="dxa"/>
+            <w:tcBorders>
+              <w:top w:val="single" w:sz="4" w:space="0" w:color="auto"/>
+              <w:left w:val="single" w:sz="2" w:space="0" w:color="000000"/>
+              <w:bottom w:val="single" w:sz="2" w:space="0" w:color="000000"/>
+              <w:right w:val="single" w:sz="2" w:space="0" w:color="000000"/>
+            </w:tcBorders>
+            <w:vAlign w:val="center"/>
+          </w:tcPr>
+          <w:p>
+            <w:pPr>
+              <w:pStyle w:val="TableContents"/>
+              <w:bidi/>
+            </w:pPr>
+            <w:r>
+              <w:t>DB6</w:t>
             </w:r>
           </w:p>
         </w:tc>
@@ -16693,6 +17318,7 @@
               <w:bidi/>
             </w:pPr>
             <w:r>
+              <w:lastRenderedPageBreak/>
               <w:t>P2.3</w:t>
             </w:r>
           </w:p>
@@ -17041,7 +17667,6 @@
               <w:bidi/>
             </w:pPr>
             <w:r>
-              <w:lastRenderedPageBreak/>
               <w:t>P4</w:t>
             </w:r>
           </w:p>
@@ -18256,7 +18881,6 @@
           <w:szCs w:val="32"/>
           <w:rtl/>
         </w:rPr>
-        <w:lastRenderedPageBreak/>
         <w:t>מסמכי נסיבות שימוש</w:t>
       </w:r>
     </w:p>
@@ -19346,6 +19970,7 @@
                 <w:szCs w:val="24"/>
                 <w:rtl/>
               </w:rPr>
+              <w:lastRenderedPageBreak/>
               <w:t xml:space="preserve">   </w:t>
             </w:r>
             <w:r>
@@ -19434,6 +20059,7 @@
                 <w:szCs w:val="24"/>
                 <w:rtl/>
               </w:rPr>
+              <w:lastRenderedPageBreak/>
               <w:t>הסתעפויות</w:t>
             </w:r>
           </w:p>
@@ -19501,7 +20127,6 @@
                 <w:szCs w:val="24"/>
                 <w:rtl/>
               </w:rPr>
-              <w:lastRenderedPageBreak/>
               <w:t>הסבר</w:t>
             </w:r>
           </w:p>
@@ -20338,6 +20963,7 @@
                 <w:szCs w:val="24"/>
                 <w:rtl/>
               </w:rPr>
+              <w:lastRenderedPageBreak/>
               <w:t xml:space="preserve">   א. פאקטה ללא סיכון:</w:t>
             </w:r>
           </w:p>
@@ -20571,7 +21197,6 @@
               <w:rPr>
                 <w:rtl/>
               </w:rPr>
-              <w:lastRenderedPageBreak/>
               <w:t>הסבר</w:t>
             </w:r>
           </w:p>
@@ -21088,6 +21713,7 @@
               <w:jc w:val="center"/>
             </w:pPr>
             <w:r>
+              <w:lastRenderedPageBreak/>
               <w:t>1</w:t>
             </w:r>
             <w:r>
@@ -21413,7 +22039,6 @@
               <w:rPr>
                 <w:rtl/>
               </w:rPr>
-              <w:lastRenderedPageBreak/>
               <w:t>הסבר</w:t>
             </w:r>
           </w:p>
@@ -21926,6 +22551,7 @@
               <w:jc w:val="center"/>
             </w:pPr>
             <w:r>
+              <w:lastRenderedPageBreak/>
               <w:t>1</w:t>
             </w:r>
             <w:r>
@@ -22253,7 +22879,6 @@
               <w:rPr>
                 <w:rtl/>
               </w:rPr>
-              <w:lastRenderedPageBreak/>
               <w:t>הסבר</w:t>
             </w:r>
           </w:p>
@@ -22716,6 +23341,7 @@
               <w:rPr>
                 <w:rtl/>
               </w:rPr>
+              <w:lastRenderedPageBreak/>
               <w:t>נותחו מספיק פאקטות, קיים מידע תקף בלוגים ובסטטיסטיקות</w:t>
             </w:r>
           </w:p>
@@ -23103,7 +23729,6 @@
               <w:rPr>
                 <w:rtl/>
               </w:rPr>
-              <w:lastRenderedPageBreak/>
               <w:t>הסבר</w:t>
             </w:r>
           </w:p>
@@ -23512,6 +24137,7 @@
                 <w:b w:val="0"/>
                 <w:bCs w:val="0"/>
               </w:rPr>
+              <w:lastRenderedPageBreak/>
               <w:t>FR2,FR3</w:t>
             </w:r>
           </w:p>
@@ -24029,7 +24655,6 @@
               <w:rPr>
                 <w:rtl/>
               </w:rPr>
-              <w:lastRenderedPageBreak/>
               <w:t>הסבר</w:t>
             </w:r>
           </w:p>
@@ -24377,6 +25002,7 @@
                 <w:bCs w:val="0"/>
                 <w:rtl/>
               </w:rPr>
+              <w:lastRenderedPageBreak/>
               <w:t>בעת חסימת משתמש או לפי דרישת מנהל</w:t>
             </w:r>
           </w:p>
@@ -24871,7 +25497,6 @@
               <w:rPr>
                 <w:rtl/>
               </w:rPr>
-              <w:lastRenderedPageBreak/>
               <w:t>הסבר</w:t>
             </w:r>
           </w:p>
@@ -25159,6 +25784,7 @@
                 <w:bCs w:val="0"/>
                 <w:rtl/>
               </w:rPr>
+              <w:lastRenderedPageBreak/>
               <w:t>בפיתוח</w:t>
             </w:r>
           </w:p>
@@ -28194,4 +28820,16 @@
   <a:objectDefaults/>
   <a:extraClrSchemeLst/>
 </a:theme>
+</file>
+
+<file path=customXml/item1.xml><?xml version="1.0" encoding="utf-8"?>
+<b:Sources xmlns:b="http://schemas.openxmlformats.org/officeDocument/2006/bibliography" xmlns="http://schemas.openxmlformats.org/officeDocument/2006/bibliography" SelectedStyle="\APASixthEditionOfficeOnline.xsl" StyleName="APA" Version="6"/>
+</file>
+
+<file path=customXml/itemProps1.xml><?xml version="1.0" encoding="utf-8"?>
+<ds:datastoreItem xmlns:ds="http://schemas.openxmlformats.org/officeDocument/2006/customXml" ds:itemID="{6B99DDA5-486D-434A-A629-4D4E65A115CE}">
+  <ds:schemaRefs>
+    <ds:schemaRef ds:uri="http://schemas.openxmlformats.org/officeDocument/2006/bibliography"/>
+  </ds:schemaRefs>
+</ds:datastoreItem>
 </file>
</xml_diff>